<commit_message>
ztransform function done use the 9th col processedvalue which after mark to store z transformed value both winvalue and zvalue would not be changed after testmakemht_hist.py processedvalue are z transformed winvalue and zvalue
</commit_message>
<xml_diff>
--- a/MS/molecular ecology之后/coverletter science-ME.docx
+++ b/MS/molecular ecology之后/coverletter science-ME.docx
@@ -73,11 +73,13 @@
         <w:rPr>
           <w:rFonts w:ascii="Times New Roman" w:hAnsi="Times New Roman" w:cs="Times New Roman"/>
           <w:b/>
+          <w:bCs/>
           <w:i/>
-          <w:sz w:val="24"/>
-          <w:szCs w:val="24"/>
-        </w:rPr>
-        <w:t>Molecular Ecology</w:t>
+          <w:iCs/>
+          <w:sz w:val="24"/>
+          <w:szCs w:val="24"/>
+        </w:rPr>
+        <w:t>science</w:t>
       </w:r>
       <w:r>
         <w:rPr>
@@ -94,7 +96,7 @@
         <w:jc w:val="right"/>
         <w:rPr>
           <w:ins w:id="0" w:author="RuiLiu" w:date="2020-01-06T18:46:00Z"/>
-          <w:rFonts w:ascii="Times New Roman" w:hAnsi="Times New Roman" w:cs="Times New Roman" w:hint="eastAsia"/>
+          <w:rFonts w:ascii="Times New Roman" w:hAnsi="Times New Roman" w:cs="Times New Roman"/>
           <w:sz w:val="24"/>
           <w:szCs w:val="24"/>
         </w:rPr>
@@ -138,10 +140,42 @@
           <w:szCs w:val="24"/>
         </w:rPr>
         <w:tab/>
-        <w:t>Jan. 7,2020</w:t>
+        <w:t xml:space="preserve">Jan. </w:t>
+      </w:r>
+      <w:r>
+        <w:rPr>
+          <w:rFonts w:ascii="Times New Roman" w:hAnsi="Times New Roman" w:cs="Times New Roman"/>
+          <w:sz w:val="24"/>
+          <w:szCs w:val="24"/>
+        </w:rPr>
+        <w:t>10</w:t>
+      </w:r>
+      <w:r>
+        <w:rPr>
+          <w:rFonts w:ascii="Times New Roman" w:hAnsi="Times New Roman" w:cs="Times New Roman"/>
+          <w:sz w:val="24"/>
+          <w:szCs w:val="24"/>
+        </w:rPr>
+        <w:t>,</w:t>
+      </w:r>
+      <w:r>
+        <w:rPr>
+          <w:rFonts w:ascii="Times New Roman" w:hAnsi="Times New Roman" w:cs="Times New Roman"/>
+          <w:sz w:val="24"/>
+          <w:szCs w:val="24"/>
+        </w:rPr>
+        <w:t xml:space="preserve"> </w:t>
       </w:r>
       <w:bookmarkStart w:id="1" w:name="_GoBack"/>
       <w:bookmarkEnd w:id="1"/>
+      <w:r>
+        <w:rPr>
+          <w:rFonts w:ascii="Times New Roman" w:hAnsi="Times New Roman" w:cs="Times New Roman"/>
+          <w:sz w:val="24"/>
+          <w:szCs w:val="24"/>
+        </w:rPr>
+        <w:t>2020</w:t>
+      </w:r>
     </w:p>
     <w:p>
       <w:pPr>
@@ -271,13 +305,23 @@
         </w:rPr>
         <w:t xml:space="preserve"> </w:t>
       </w:r>
-      <w:r>
-        <w:rPr>
-          <w:rFonts w:ascii="Times New Roman" w:hAnsi="Times New Roman" w:cs="Times New Roman"/>
-          <w:sz w:val="24"/>
-          <w:szCs w:val="24"/>
-        </w:rPr>
-        <w:t xml:space="preserve">Thus </w:t>
+      <w:proofErr w:type="gramStart"/>
+      <w:r>
+        <w:rPr>
+          <w:rFonts w:ascii="Times New Roman" w:hAnsi="Times New Roman" w:cs="Times New Roman"/>
+          <w:sz w:val="24"/>
+          <w:szCs w:val="24"/>
+        </w:rPr>
+        <w:t>Thus</w:t>
+      </w:r>
+      <w:proofErr w:type="gramEnd"/>
+      <w:r>
+        <w:rPr>
+          <w:rFonts w:ascii="Times New Roman" w:hAnsi="Times New Roman" w:cs="Times New Roman"/>
+          <w:sz w:val="24"/>
+          <w:szCs w:val="24"/>
+        </w:rPr>
+        <w:t xml:space="preserve"> </w:t>
       </w:r>
       <w:r>
         <w:rPr>
@@ -566,7 +610,25 @@
           <w:sz w:val="24"/>
           <w:szCs w:val="24"/>
         </w:rPr>
-        <w:t xml:space="preserve">Furthermore, we presented the assemblies of two wild duck species’ genome and provide genomic sequencing data of eight domestic duck breeds and eight wild duck species, together with two outgroups (Muscovy duck and Taihu goose). We </w:t>
+        <w:t xml:space="preserve">Furthermore, we presented the assemblies of two wild duck species’ genome and provide genomic sequencing data of eight domestic duck breeds and eight wild duck species, together with two outgroups (Muscovy duck and </w:t>
+      </w:r>
+      <w:proofErr w:type="spellStart"/>
+      <w:r>
+        <w:rPr>
+          <w:rFonts w:ascii="Times New Roman" w:hAnsi="Times New Roman" w:cs="Times New Roman"/>
+          <w:sz w:val="24"/>
+          <w:szCs w:val="24"/>
+        </w:rPr>
+        <w:t>Taihu</w:t>
+      </w:r>
+      <w:proofErr w:type="spellEnd"/>
+      <w:r>
+        <w:rPr>
+          <w:rFonts w:ascii="Times New Roman" w:hAnsi="Times New Roman" w:cs="Times New Roman"/>
+          <w:sz w:val="24"/>
+          <w:szCs w:val="24"/>
+        </w:rPr>
+        <w:t xml:space="preserve"> goose). We </w:t>
       </w:r>
       <w:r>
         <w:rPr>
@@ -751,7 +813,25 @@
           <w:sz w:val="24"/>
           <w:szCs w:val="24"/>
         </w:rPr>
-        <w:t>It not only highlight the evolution context for functional studies</w:t>
+        <w:t xml:space="preserve">It not only </w:t>
+      </w:r>
+      <w:proofErr w:type="gramStart"/>
+      <w:r>
+        <w:rPr>
+          <w:rFonts w:ascii="Times New Roman" w:hAnsi="Times New Roman" w:cs="Times New Roman"/>
+          <w:sz w:val="24"/>
+          <w:szCs w:val="24"/>
+        </w:rPr>
+        <w:t>highlight</w:t>
+      </w:r>
+      <w:proofErr w:type="gramEnd"/>
+      <w:r>
+        <w:rPr>
+          <w:rFonts w:ascii="Times New Roman" w:hAnsi="Times New Roman" w:cs="Times New Roman"/>
+          <w:sz w:val="24"/>
+          <w:szCs w:val="24"/>
+        </w:rPr>
+        <w:t xml:space="preserve"> the evolution context for functional studies</w:t>
       </w:r>
       <w:r>
         <w:rPr>
@@ -1049,6 +1129,7 @@
           </wp:inline>
         </w:drawing>
       </w:r>
+      <w:proofErr w:type="spellStart"/>
       <w:r>
         <w:rPr>
           <w:rFonts w:ascii="Times New Roman" w:eastAsia="Times New Roman" w:hAnsi="Times New Roman" w:cs="Times New Roman"/>
@@ -1058,6 +1139,7 @@
         </w:rPr>
         <w:t>i</w:t>
       </w:r>
+      <w:proofErr w:type="spellEnd"/>
       <w:r>
         <w:rPr>
           <w:rFonts w:ascii="Times New Roman" w:hAnsi="Times New Roman" w:cs="Times New Roman"/>
@@ -1196,25 +1278,7 @@
           <w:szCs w:val="24"/>
         </w:rPr>
         <w:lastRenderedPageBreak/>
-        <w:t>Molecular</w:t>
-      </w:r>
-      <w:r>
-        <w:rPr>
-          <w:rFonts w:ascii="Times New Roman" w:hAnsi="Times New Roman" w:cs="Times New Roman"/>
-          <w:sz w:val="24"/>
-          <w:szCs w:val="24"/>
-        </w:rPr>
-        <w:t xml:space="preserve"> </w:t>
-      </w:r>
-      <w:r>
-        <w:rPr>
-          <w:rFonts w:ascii="Times New Roman" w:hAnsi="Times New Roman" w:cs="Times New Roman"/>
-          <w:b/>
-          <w:i/>
-          <w:sz w:val="24"/>
-          <w:szCs w:val="24"/>
-        </w:rPr>
-        <w:t>Ecology</w:t>
+        <w:t>science</w:t>
       </w:r>
       <w:r>
         <w:rPr>
@@ -1340,7 +1404,7 @@
           <w:sz w:val="24"/>
           <w:szCs w:val="24"/>
         </w:rPr>
-        <w:t>Molecular Ecology</w:t>
+        <w:t>science</w:t>
       </w:r>
       <w:r>
         <w:rPr>
@@ -2549,7 +2613,7 @@
 </file>
 
 <file path=customXml/itemProps1.xml><?xml version="1.0" encoding="utf-8"?>
-<ds:datastoreItem xmlns:ds="http://schemas.openxmlformats.org/officeDocument/2006/customXml" ds:itemID="{60AC8416-6A18-41D6-B764-933AAA439801}">
+<ds:datastoreItem xmlns:ds="http://schemas.openxmlformats.org/officeDocument/2006/customXml" ds:itemID="{3C4E398A-B237-4640-8AD2-FA2DC726D3E4}">
   <ds:schemaRefs>
     <ds:schemaRef ds:uri="http://schemas.openxmlformats.org/officeDocument/2006/bibliography"/>
   </ds:schemaRefs>

</xml_diff>